<commit_message>
revised hypothesis, displayed columns, and detailed the todo list
</commit_message>
<xml_diff>
--- a/Homework1.docx
+++ b/Homework1.docx
@@ -8,10 +8,384 @@
       </w:r>
     </w:p>
     <w:p>
-      <w:r>
-        <w:t>Analysis unemployment rate of Georgia‘s counties from 2017 - 2021</w:t>
+      <w:pPr>
+        <w:rPr>
+          <w:b/>
+          <w:bCs/>
+        </w:rPr>
+      </w:pPr>
+      <w:r>
+        <w:rPr>
+          <w:b/>
+          <w:bCs/>
+        </w:rPr>
+        <w:t xml:space="preserve">In 2019 – 2021 the unemployment rate of Tourism-dependent states is higher than one of Tech-driven states </w:t>
       </w:r>
     </w:p>
+    <w:p>
+      <w:r>
+        <w:t>Display all columns in data file, using head Jobs.data.csv</w:t>
+      </w:r>
+    </w:p>
+    <w:p>
+      <w:r>
+        <w:drawing>
+          <wp:inline distT="0" distB="0" distL="0" distR="0" wp14:anchorId="5221564F" wp14:editId="515FDB3A">
+            <wp:extent cx="5943600" cy="1440815"/>
+            <wp:effectExtent l="0" t="0" r="0" b="6985"/>
+            <wp:docPr id="696133595" name="Picture 1"/>
+            <wp:cNvGraphicFramePr>
+              <a:graphicFrameLocks xmlns:a="http://schemas.openxmlformats.org/drawingml/2006/main" noChangeAspect="1"/>
+            </wp:cNvGraphicFramePr>
+            <a:graphic xmlns:a="http://schemas.openxmlformats.org/drawingml/2006/main">
+              <a:graphicData uri="http://schemas.openxmlformats.org/drawingml/2006/picture">
+                <pic:pic xmlns:pic="http://schemas.openxmlformats.org/drawingml/2006/picture">
+                  <pic:nvPicPr>
+                    <pic:cNvPr id="696133595" name=""/>
+                    <pic:cNvPicPr/>
+                  </pic:nvPicPr>
+                  <pic:blipFill>
+                    <a:blip r:embed="rId4"/>
+                    <a:stretch>
+                      <a:fillRect/>
+                    </a:stretch>
+                  </pic:blipFill>
+                  <pic:spPr>
+                    <a:xfrm>
+                      <a:off x="0" y="0"/>
+                      <a:ext cx="5943600" cy="1440815"/>
+                    </a:xfrm>
+                    <a:prstGeom prst="rect">
+                      <a:avLst/>
+                    </a:prstGeom>
+                  </pic:spPr>
+                </pic:pic>
+              </a:graphicData>
+            </a:graphic>
+          </wp:inline>
+        </w:drawing>
+      </w:r>
+    </w:p>
+    <w:p>
+      <w:r>
+        <w:t>Try to display 1</w:t>
+      </w:r>
+      <w:r>
+        <w:rPr>
+          <w:vertAlign w:val="superscript"/>
+        </w:rPr>
+        <w:t>st</w:t>
+      </w:r>
+      <w:r>
+        <w:t xml:space="preserve"> column to make sure the format of data file is correct</w:t>
+      </w:r>
+    </w:p>
+    <w:p>
+      <w:r>
+        <w:drawing>
+          <wp:inline distT="0" distB="0" distL="0" distR="0" wp14:anchorId="23794E90" wp14:editId="35CA45E4">
+            <wp:extent cx="5943600" cy="698500"/>
+            <wp:effectExtent l="0" t="0" r="0" b="6350"/>
+            <wp:docPr id="1046134162" name="Picture 1"/>
+            <wp:cNvGraphicFramePr>
+              <a:graphicFrameLocks xmlns:a="http://schemas.openxmlformats.org/drawingml/2006/main" noChangeAspect="1"/>
+            </wp:cNvGraphicFramePr>
+            <a:graphic xmlns:a="http://schemas.openxmlformats.org/drawingml/2006/main">
+              <a:graphicData uri="http://schemas.openxmlformats.org/drawingml/2006/picture">
+                <pic:pic xmlns:pic="http://schemas.openxmlformats.org/drawingml/2006/picture">
+                  <pic:nvPicPr>
+                    <pic:cNvPr id="1046134162" name=""/>
+                    <pic:cNvPicPr/>
+                  </pic:nvPicPr>
+                  <pic:blipFill>
+                    <a:blip r:embed="rId5"/>
+                    <a:stretch>
+                      <a:fillRect/>
+                    </a:stretch>
+                  </pic:blipFill>
+                  <pic:spPr>
+                    <a:xfrm>
+                      <a:off x="0" y="0"/>
+                      <a:ext cx="5943600" cy="698500"/>
+                    </a:xfrm>
+                    <a:prstGeom prst="rect">
+                      <a:avLst/>
+                    </a:prstGeom>
+                  </pic:spPr>
+                </pic:pic>
+              </a:graphicData>
+            </a:graphic>
+          </wp:inline>
+        </w:drawing>
+      </w:r>
+    </w:p>
+    <w:p>
+      <w:r>
+        <w:t xml:space="preserve">The goal is </w:t>
+      </w:r>
+      <w:r>
+        <w:t>comparing</w:t>
+      </w:r>
+      <w:r>
+        <w:t xml:space="preserve"> the unemployment rate of </w:t>
+      </w:r>
+      <w:r>
+        <w:t xml:space="preserve">some specific states in 2019 – 2021. Since each state has various </w:t>
+      </w:r>
+      <w:proofErr w:type="gramStart"/>
+      <w:r>
+        <w:t>amount</w:t>
+      </w:r>
+      <w:proofErr w:type="gramEnd"/>
+      <w:r>
+        <w:t xml:space="preserve"> of counties</w:t>
+      </w:r>
+      <w:proofErr w:type="gramStart"/>
+      <w:r>
+        <w:t>, therefore</w:t>
+      </w:r>
+      <w:proofErr w:type="gramEnd"/>
+      <w:r>
+        <w:t xml:space="preserve"> it is necessary to calculate the unemployment rate of those states based on their civilian labor force</w:t>
+      </w:r>
+    </w:p>
+    <w:p>
+      <w:r>
+        <w:drawing>
+          <wp:inline distT="0" distB="0" distL="0" distR="0" wp14:anchorId="57E36F72" wp14:editId="1AD40B25">
+            <wp:extent cx="5943600" cy="811530"/>
+            <wp:effectExtent l="0" t="0" r="0" b="7620"/>
+            <wp:docPr id="203619908" name="Picture 1"/>
+            <wp:cNvGraphicFramePr>
+              <a:graphicFrameLocks xmlns:a="http://schemas.openxmlformats.org/drawingml/2006/main" noChangeAspect="1"/>
+            </wp:cNvGraphicFramePr>
+            <a:graphic xmlns:a="http://schemas.openxmlformats.org/drawingml/2006/main">
+              <a:graphicData uri="http://schemas.openxmlformats.org/drawingml/2006/picture">
+                <pic:pic xmlns:pic="http://schemas.openxmlformats.org/drawingml/2006/picture">
+                  <pic:nvPicPr>
+                    <pic:cNvPr id="203619908" name=""/>
+                    <pic:cNvPicPr/>
+                  </pic:nvPicPr>
+                  <pic:blipFill>
+                    <a:blip r:embed="rId6"/>
+                    <a:stretch>
+                      <a:fillRect/>
+                    </a:stretch>
+                  </pic:blipFill>
+                  <pic:spPr>
+                    <a:xfrm>
+                      <a:off x="0" y="0"/>
+                      <a:ext cx="5943600" cy="811530"/>
+                    </a:xfrm>
+                    <a:prstGeom prst="rect">
+                      <a:avLst/>
+                    </a:prstGeom>
+                  </pic:spPr>
+                </pic:pic>
+              </a:graphicData>
+            </a:graphic>
+          </wp:inline>
+        </w:drawing>
+      </w:r>
+    </w:p>
+    <w:tbl>
+      <w:tblPr>
+        <w:tblStyle w:val="TableGrid"/>
+        <w:tblW w:w="0" w:type="auto"/>
+        <w:tblLook w:val="04A0" w:firstRow="1" w:lastRow="0" w:firstColumn="1" w:lastColumn="0" w:noHBand="0" w:noVBand="1"/>
+      </w:tblPr>
+      <w:tblGrid>
+        <w:gridCol w:w="4675"/>
+        <w:gridCol w:w="4675"/>
+      </w:tblGrid>
+      <w:tr>
+        <w:tc>
+          <w:tcPr>
+            <w:tcW w:w="4675" w:type="dxa"/>
+          </w:tcPr>
+          <w:p>
+            <w:r>
+              <w:t>Field</w:t>
+            </w:r>
+          </w:p>
+        </w:tc>
+        <w:tc>
+          <w:tcPr>
+            <w:tcW w:w="4675" w:type="dxa"/>
+          </w:tcPr>
+          <w:p>
+            <w:r>
+              <w:t>Column number</w:t>
+            </w:r>
+          </w:p>
+        </w:tc>
+      </w:tr>
+      <w:tr>
+        <w:tc>
+          <w:tcPr>
+            <w:tcW w:w="4675" w:type="dxa"/>
+          </w:tcPr>
+          <w:p>
+            <w:r>
+              <w:t>NumUnemployed20</w:t>
+            </w:r>
+            <w:r>
+              <w:t>19</w:t>
+            </w:r>
+          </w:p>
+        </w:tc>
+        <w:tc>
+          <w:tcPr>
+            <w:tcW w:w="4675" w:type="dxa"/>
+          </w:tcPr>
+          <w:p>
+            <w:r>
+              <w:t>57</w:t>
+            </w:r>
+          </w:p>
+        </w:tc>
+      </w:tr>
+      <w:tr>
+        <w:tc>
+          <w:tcPr>
+            <w:tcW w:w="4675" w:type="dxa"/>
+          </w:tcPr>
+          <w:p>
+            <w:r>
+              <w:t>NumUnemployed20</w:t>
+            </w:r>
+            <w:r>
+              <w:t>20</w:t>
+            </w:r>
+          </w:p>
+        </w:tc>
+        <w:tc>
+          <w:tcPr>
+            <w:tcW w:w="4675" w:type="dxa"/>
+          </w:tcPr>
+          <w:p>
+            <w:r>
+              <w:t>40</w:t>
+            </w:r>
+          </w:p>
+        </w:tc>
+      </w:tr>
+      <w:tr>
+        <w:tc>
+          <w:tcPr>
+            <w:tcW w:w="4675" w:type="dxa"/>
+          </w:tcPr>
+          <w:p>
+            <w:r>
+              <w:t>NumUnemployed20</w:t>
+            </w:r>
+            <w:r>
+              <w:t>21</w:t>
+            </w:r>
+          </w:p>
+        </w:tc>
+        <w:tc>
+          <w:tcPr>
+            <w:tcW w:w="4675" w:type="dxa"/>
+          </w:tcPr>
+          <w:p>
+            <w:r>
+              <w:t>50</w:t>
+            </w:r>
+          </w:p>
+        </w:tc>
+      </w:tr>
+      <w:tr>
+        <w:trPr>
+          <w:trHeight w:val="314"/>
+        </w:trPr>
+        <w:tc>
+          <w:tcPr>
+            <w:tcW w:w="4675" w:type="dxa"/>
+          </w:tcPr>
+          <w:p>
+            <w:r>
+              <w:t>NumCivLaborforce2019</w:t>
+            </w:r>
+          </w:p>
+        </w:tc>
+        <w:tc>
+          <w:tcPr>
+            <w:tcW w:w="4675" w:type="dxa"/>
+          </w:tcPr>
+          <w:p>
+            <w:r>
+              <w:t>58</w:t>
+            </w:r>
+          </w:p>
+        </w:tc>
+      </w:tr>
+      <w:tr>
+        <w:tc>
+          <w:tcPr>
+            <w:tcW w:w="4675" w:type="dxa"/>
+          </w:tcPr>
+          <w:p>
+            <w:r>
+              <w:t>NumCivLaborforce20</w:t>
+            </w:r>
+            <w:r>
+              <w:t>20</w:t>
+            </w:r>
+          </w:p>
+        </w:tc>
+        <w:tc>
+          <w:tcPr>
+            <w:tcW w:w="4675" w:type="dxa"/>
+          </w:tcPr>
+          <w:p>
+            <w:r>
+              <w:t>54</w:t>
+            </w:r>
+          </w:p>
+        </w:tc>
+      </w:tr>
+      <w:tr>
+        <w:tc>
+          <w:tcPr>
+            <w:tcW w:w="4675" w:type="dxa"/>
+          </w:tcPr>
+          <w:p>
+            <w:r>
+              <w:t>NumCivLaborforce20</w:t>
+            </w:r>
+            <w:r>
+              <w:t>21</w:t>
+            </w:r>
+          </w:p>
+        </w:tc>
+        <w:tc>
+          <w:tcPr>
+            <w:tcW w:w="4675" w:type="dxa"/>
+          </w:tcPr>
+          <w:p>
+            <w:r>
+              <w:t>52</w:t>
+            </w:r>
+          </w:p>
+        </w:tc>
+      </w:tr>
+    </w:tbl>
+    <w:p/>
+    <w:p>
+      <w:r>
+        <w:t>Tourism-dependent states</w:t>
+      </w:r>
+      <w:r>
+        <w:t>: Hawai, Nevada, Florida</w:t>
+      </w:r>
+    </w:p>
+    <w:p>
+      <w:r>
+        <w:t>Tech-driven states: California, Washington, Texas</w:t>
+      </w:r>
+    </w:p>
+    <w:p/>
     <w:sectPr>
       <w:pgSz w:w="12240" w:h="15840"/>
       <w:pgMar w:top="1440" w:right="1440" w:bottom="1440" w:left="1440" w:header="720" w:footer="720" w:gutter="0"/>
@@ -625,7 +999,6 @@
   <w:style w:type="character" w:default="1" w:styleId="DefaultParagraphFont">
     <w:name w:val="Default Paragraph Font"/>
     <w:uiPriority w:val="1"/>
-    <w:semiHidden/>
     <w:unhideWhenUsed/>
   </w:style>
   <w:style w:type="table" w:default="1" w:styleId="TableNormal">
@@ -938,6 +1311,25 @@
       <w:color w:val="0F4761" w:themeColor="accent1" w:themeShade="BF"/>
       <w:spacing w:val="5"/>
     </w:rPr>
+  </w:style>
+  <w:style w:type="table" w:styleId="TableGrid">
+    <w:name w:val="Table Grid"/>
+    <w:basedOn w:val="TableNormal"/>
+    <w:uiPriority w:val="39"/>
+    <w:rsid w:val="002C2CDC"/>
+    <w:pPr>
+      <w:spacing w:after="0" w:line="240" w:lineRule="auto"/>
+    </w:pPr>
+    <w:tblPr>
+      <w:tblBorders>
+        <w:top w:val="single" w:sz="4" w:space="0" w:color="auto"/>
+        <w:left w:val="single" w:sz="4" w:space="0" w:color="auto"/>
+        <w:bottom w:val="single" w:sz="4" w:space="0" w:color="auto"/>
+        <w:right w:val="single" w:sz="4" w:space="0" w:color="auto"/>
+        <w:insideH w:val="single" w:sz="4" w:space="0" w:color="auto"/>
+        <w:insideV w:val="single" w:sz="4" w:space="0" w:color="auto"/>
+      </w:tblBorders>
+    </w:tblPr>
   </w:style>
 </w:styles>
 </file>

</xml_diff>

<commit_message>
added early conclusion about NumUnemployment change 2019-2021
</commit_message>
<xml_diff>
--- a/Homework1.docx
+++ b/Homework1.docx
@@ -23,12 +23,45 @@
       </w:r>
     </w:p>
     <w:p>
-      <w:r>
+      <w:pPr>
+        <w:rPr>
+          <w:b/>
+          <w:bCs/>
+        </w:rPr>
+      </w:pPr>
+      <w:r>
+        <w:rPr>
+          <w:b/>
+          <w:bCs/>
+        </w:rPr>
+        <w:t xml:space="preserve">A - </w:t>
+      </w:r>
+      <w:r>
+        <w:rPr>
+          <w:b/>
+          <w:bCs/>
+        </w:rPr>
         <w:t>Display all columns in data file, using head Jobs.data.csv</w:t>
       </w:r>
     </w:p>
     <w:p>
-      <w:r>
+      <w:pPr>
+        <w:rPr>
+          <w:color w:val="156082" w:themeColor="accent1"/>
+        </w:rPr>
+      </w:pPr>
+      <w:r>
+        <w:rPr>
+          <w:color w:val="156082" w:themeColor="accent1"/>
+        </w:rPr>
+        <w:t>head Jobs_data.csv</w:t>
+      </w:r>
+    </w:p>
+    <w:p>
+      <w:r>
+        <w:rPr>
+          <w:noProof/>
+        </w:rPr>
         <w:drawing>
           <wp:inline distT="0" distB="0" distL="0" distR="0" wp14:anchorId="5221564F" wp14:editId="515FDB3A">
             <wp:extent cx="5943600" cy="1440815"/>
@@ -81,7 +114,35 @@
       </w:r>
     </w:p>
     <w:p>
-      <w:r>
+      <w:pPr>
+        <w:rPr>
+          <w:color w:val="156082" w:themeColor="accent1"/>
+        </w:rPr>
+      </w:pPr>
+      <w:r>
+        <w:rPr>
+          <w:color w:val="156082" w:themeColor="accent1"/>
+        </w:rPr>
+        <w:t xml:space="preserve">head </w:t>
+      </w:r>
+      <w:r>
+        <w:rPr>
+          <w:color w:val="156082" w:themeColor="accent1"/>
+        </w:rPr>
+        <w:t xml:space="preserve">-1 </w:t>
+      </w:r>
+      <w:r>
+        <w:rPr>
+          <w:color w:val="156082" w:themeColor="accent1"/>
+        </w:rPr>
+        <w:t>Jobs_data.csv</w:t>
+      </w:r>
+    </w:p>
+    <w:p>
+      <w:r>
+        <w:rPr>
+          <w:noProof/>
+        </w:rPr>
         <w:drawing>
           <wp:inline distT="0" distB="0" distL="0" distR="0" wp14:anchorId="23794E90" wp14:editId="35CA45E4">
             <wp:extent cx="5943600" cy="698500"/>
@@ -132,60 +193,22 @@
       <w:r>
         <w:t xml:space="preserve">some specific states in 2019 – 2021. Since each state has various </w:t>
       </w:r>
-      <w:proofErr w:type="gramStart"/>
-      <w:r>
-        <w:t>amount</w:t>
-      </w:r>
-      <w:proofErr w:type="gramEnd"/>
-      <w:r>
-        <w:t xml:space="preserve"> of counties</w:t>
-      </w:r>
-      <w:proofErr w:type="gramStart"/>
-      <w:r>
-        <w:t>, therefore</w:t>
-      </w:r>
-      <w:proofErr w:type="gramEnd"/>
-      <w:r>
-        <w:t xml:space="preserve"> it is necessary to calculate the unemployment rate of those states based on their civilian labor force</w:t>
-      </w:r>
-    </w:p>
-    <w:p>
-      <w:r>
-        <w:drawing>
-          <wp:inline distT="0" distB="0" distL="0" distR="0" wp14:anchorId="57E36F72" wp14:editId="1AD40B25">
-            <wp:extent cx="5943600" cy="811530"/>
-            <wp:effectExtent l="0" t="0" r="0" b="7620"/>
-            <wp:docPr id="203619908" name="Picture 1"/>
-            <wp:cNvGraphicFramePr>
-              <a:graphicFrameLocks xmlns:a="http://schemas.openxmlformats.org/drawingml/2006/main" noChangeAspect="1"/>
-            </wp:cNvGraphicFramePr>
-            <a:graphic xmlns:a="http://schemas.openxmlformats.org/drawingml/2006/main">
-              <a:graphicData uri="http://schemas.openxmlformats.org/drawingml/2006/picture">
-                <pic:pic xmlns:pic="http://schemas.openxmlformats.org/drawingml/2006/picture">
-                  <pic:nvPicPr>
-                    <pic:cNvPr id="203619908" name=""/>
-                    <pic:cNvPicPr/>
-                  </pic:nvPicPr>
-                  <pic:blipFill>
-                    <a:blip r:embed="rId6"/>
-                    <a:stretch>
-                      <a:fillRect/>
-                    </a:stretch>
-                  </pic:blipFill>
-                  <pic:spPr>
-                    <a:xfrm>
-                      <a:off x="0" y="0"/>
-                      <a:ext cx="5943600" cy="811530"/>
-                    </a:xfrm>
-                    <a:prstGeom prst="rect">
-                      <a:avLst/>
-                    </a:prstGeom>
-                  </pic:spPr>
-                </pic:pic>
-              </a:graphicData>
-            </a:graphic>
-          </wp:inline>
-        </w:drawing>
+      <w:r>
+        <w:t>number</w:t>
+      </w:r>
+      <w:r>
+        <w:t xml:space="preserve"> of counties, therefore it is necessary to calculate the unemployment rate of those states based on their civilian labor force</w:t>
+      </w:r>
+      <w:r>
+        <w:t>.</w:t>
+      </w:r>
+    </w:p>
+    <w:p>
+      <w:r>
+        <w:rPr>
+          <w:highlight w:val="yellow"/>
+        </w:rPr>
+        <w:t>Unempoloyment Rate (state) = Total of NumUnemployed / Total of CivilianLaborForce</w:t>
       </w:r>
     </w:p>
     <w:tbl>
@@ -227,10 +250,7 @@
           </w:tcPr>
           <w:p>
             <w:r>
-              <w:t>NumUnemployed20</w:t>
-            </w:r>
-            <w:r>
-              <w:t>19</w:t>
+              <w:t>State</w:t>
             </w:r>
           </w:p>
         </w:tc>
@@ -240,7 +260,7 @@
           </w:tcPr>
           <w:p>
             <w:r>
-              <w:t>57</w:t>
+              <w:t>2</w:t>
             </w:r>
           </w:p>
         </w:tc>
@@ -252,10 +272,7 @@
           </w:tcPr>
           <w:p>
             <w:r>
-              <w:t>NumUnemployed20</w:t>
-            </w:r>
-            <w:r>
-              <w:t>20</w:t>
+              <w:t>County</w:t>
             </w:r>
           </w:p>
         </w:tc>
@@ -265,7 +282,7 @@
           </w:tcPr>
           <w:p>
             <w:r>
-              <w:t>40</w:t>
+              <w:t>3</w:t>
             </w:r>
           </w:p>
         </w:tc>
@@ -280,7 +297,7 @@
               <w:t>NumUnemployed20</w:t>
             </w:r>
             <w:r>
-              <w:t>21</w:t>
+              <w:t>19</w:t>
             </w:r>
           </w:p>
         </w:tc>
@@ -290,7 +307,66 @@
           </w:tcPr>
           <w:p>
             <w:r>
-              <w:t>50</w:t>
+              <w:t>5</w:t>
+            </w:r>
+            <w:r>
+              <w:t>8</w:t>
+            </w:r>
+          </w:p>
+        </w:tc>
+      </w:tr>
+      <w:tr>
+        <w:tc>
+          <w:tcPr>
+            <w:tcW w:w="4675" w:type="dxa"/>
+          </w:tcPr>
+          <w:p>
+            <w:r>
+              <w:t>NumUnemployed20</w:t>
+            </w:r>
+            <w:r>
+              <w:t>20</w:t>
+            </w:r>
+          </w:p>
+        </w:tc>
+        <w:tc>
+          <w:tcPr>
+            <w:tcW w:w="4675" w:type="dxa"/>
+          </w:tcPr>
+          <w:p>
+            <w:r>
+              <w:t>4</w:t>
+            </w:r>
+            <w:r>
+              <w:t>1</w:t>
+            </w:r>
+          </w:p>
+        </w:tc>
+      </w:tr>
+      <w:tr>
+        <w:tc>
+          <w:tcPr>
+            <w:tcW w:w="4675" w:type="dxa"/>
+          </w:tcPr>
+          <w:p>
+            <w:r>
+              <w:t>NumUnemployed20</w:t>
+            </w:r>
+            <w:r>
+              <w:t>21</w:t>
+            </w:r>
+          </w:p>
+        </w:tc>
+        <w:tc>
+          <w:tcPr>
+            <w:tcW w:w="4675" w:type="dxa"/>
+          </w:tcPr>
+          <w:p>
+            <w:r>
+              <w:t>5</w:t>
+            </w:r>
+            <w:r>
+              <w:t>1</w:t>
             </w:r>
           </w:p>
         </w:tc>
@@ -315,7 +391,10 @@
           </w:tcPr>
           <w:p>
             <w:r>
-              <w:t>58</w:t>
+              <w:t>5</w:t>
+            </w:r>
+            <w:r>
+              <w:t>9</w:t>
             </w:r>
           </w:p>
         </w:tc>
@@ -340,7 +419,10 @@
           </w:tcPr>
           <w:p>
             <w:r>
-              <w:t>54</w:t>
+              <w:t>5</w:t>
+            </w:r>
+            <w:r>
+              <w:t>5</w:t>
             </w:r>
           </w:p>
         </w:tc>
@@ -365,7 +447,10 @@
           </w:tcPr>
           <w:p>
             <w:r>
-              <w:t>52</w:t>
+              <w:t>5</w:t>
+            </w:r>
+            <w:r>
+              <w:t>3</w:t>
             </w:r>
           </w:p>
         </w:tc>
@@ -374,18 +459,258 @@
     <w:p/>
     <w:p>
       <w:r>
+        <w:rPr>
+          <w:u w:val="single"/>
+        </w:rPr>
         <w:t>Tourism-dependent states</w:t>
       </w:r>
       <w:r>
-        <w:t>: Hawai, Nevada, Florida</w:t>
-      </w:r>
-    </w:p>
-    <w:p>
-      <w:r>
-        <w:t>Tech-driven states: California, Washington, Texas</w:t>
-      </w:r>
-    </w:p>
-    <w:p/>
+        <w:t>: Hawai</w:t>
+      </w:r>
+      <w:r>
+        <w:t xml:space="preserve"> HW</w:t>
+      </w:r>
+      <w:r>
+        <w:t>, Nevada</w:t>
+      </w:r>
+      <w:r>
+        <w:t xml:space="preserve"> NV</w:t>
+      </w:r>
+    </w:p>
+    <w:p>
+      <w:r>
+        <w:rPr>
+          <w:u w:val="single"/>
+        </w:rPr>
+        <w:t>Tech-driven states:</w:t>
+      </w:r>
+      <w:r>
+        <w:t xml:space="preserve"> California</w:t>
+      </w:r>
+      <w:r>
+        <w:t xml:space="preserve"> CA</w:t>
+      </w:r>
+      <w:r>
+        <w:t>, Washington</w:t>
+      </w:r>
+      <w:r>
+        <w:t xml:space="preserve"> WA</w:t>
+      </w:r>
+    </w:p>
+    <w:p>
+      <w:pPr>
+        <w:rPr>
+          <w:b/>
+          <w:bCs/>
+        </w:rPr>
+      </w:pPr>
+      <w:r>
+        <w:rPr>
+          <w:b/>
+          <w:bCs/>
+        </w:rPr>
+        <w:lastRenderedPageBreak/>
+        <w:t>B - Using awk to create a new file with desired columns</w:t>
+      </w:r>
+    </w:p>
+    <w:p>
+      <w:r>
+        <w:t xml:space="preserve">Display </w:t>
+      </w:r>
+      <w:r>
+        <w:t>first 10 columns of new file Unemp_labor.txt</w:t>
+      </w:r>
+    </w:p>
+    <w:p>
+      <w:pPr>
+        <w:rPr>
+          <w:color w:val="156082" w:themeColor="accent1"/>
+        </w:rPr>
+      </w:pPr>
+      <w:r>
+        <w:rPr>
+          <w:color w:val="156082" w:themeColor="accent1"/>
+        </w:rPr>
+        <w:t>head -1 Unemp_labor.txt</w:t>
+      </w:r>
+    </w:p>
+    <w:p>
+      <w:pPr>
+        <w:rPr>
+          <w:color w:val="156082" w:themeColor="accent1"/>
+        </w:rPr>
+      </w:pPr>
+      <w:r>
+        <w:rPr>
+          <w:color w:val="156082" w:themeColor="accent1"/>
+        </w:rPr>
+        <w:t>head Unemp_labor.txt</w:t>
+      </w:r>
+    </w:p>
+    <w:p>
+      <w:r>
+        <w:drawing>
+          <wp:inline distT="0" distB="0" distL="0" distR="0" wp14:anchorId="43FFEF9B" wp14:editId="36CB0543">
+            <wp:extent cx="5943600" cy="1356995"/>
+            <wp:effectExtent l="0" t="0" r="0" b="0"/>
+            <wp:docPr id="782039925" name="Picture 1"/>
+            <wp:cNvGraphicFramePr>
+              <a:graphicFrameLocks xmlns:a="http://schemas.openxmlformats.org/drawingml/2006/main" noChangeAspect="1"/>
+            </wp:cNvGraphicFramePr>
+            <a:graphic xmlns:a="http://schemas.openxmlformats.org/drawingml/2006/main">
+              <a:graphicData uri="http://schemas.openxmlformats.org/drawingml/2006/picture">
+                <pic:pic xmlns:pic="http://schemas.openxmlformats.org/drawingml/2006/picture">
+                  <pic:nvPicPr>
+                    <pic:cNvPr id="782039925" name=""/>
+                    <pic:cNvPicPr/>
+                  </pic:nvPicPr>
+                  <pic:blipFill>
+                    <a:blip r:embed="rId6"/>
+                    <a:stretch>
+                      <a:fillRect/>
+                    </a:stretch>
+                  </pic:blipFill>
+                  <pic:spPr>
+                    <a:xfrm>
+                      <a:off x="0" y="0"/>
+                      <a:ext cx="5943600" cy="1356995"/>
+                    </a:xfrm>
+                    <a:prstGeom prst="rect">
+                      <a:avLst/>
+                    </a:prstGeom>
+                  </pic:spPr>
+                </pic:pic>
+              </a:graphicData>
+            </a:graphic>
+          </wp:inline>
+        </w:drawing>
+      </w:r>
+    </w:p>
+    <w:p>
+      <w:r>
+        <w:t>The number of unemployed in Hawai in 2020 is higher than in 2019 due to the impact of COVID-19, and decreased in 2021 after the economic recovery</w:t>
+      </w:r>
+      <w:r>
+        <w:t xml:space="preserve"> </w:t>
+      </w:r>
+    </w:p>
+    <w:p>
+      <w:r>
+        <w:rPr>
+          <w:color w:val="156082" w:themeColor="accent1"/>
+        </w:rPr>
+        <w:t>awk '/HI/ {print $1,$2,$3,$4,$5}' Unemp_labor.txt</w:t>
+      </w:r>
+      <w:r>
+        <w:rPr>
+          <w:color w:val="156082" w:themeColor="accent1"/>
+        </w:rPr>
+        <w:t xml:space="preserve"> </w:t>
+      </w:r>
+      <w:r>
+        <w:drawing>
+          <wp:inline distT="0" distB="0" distL="0" distR="0" wp14:anchorId="673EDDA4" wp14:editId="50F0E80A">
+            <wp:extent cx="5943600" cy="815975"/>
+            <wp:effectExtent l="0" t="0" r="0" b="3175"/>
+            <wp:docPr id="1804586900" name="Picture 1"/>
+            <wp:cNvGraphicFramePr>
+              <a:graphicFrameLocks xmlns:a="http://schemas.openxmlformats.org/drawingml/2006/main" noChangeAspect="1"/>
+            </wp:cNvGraphicFramePr>
+            <a:graphic xmlns:a="http://schemas.openxmlformats.org/drawingml/2006/main">
+              <a:graphicData uri="http://schemas.openxmlformats.org/drawingml/2006/picture">
+                <pic:pic xmlns:pic="http://schemas.openxmlformats.org/drawingml/2006/picture">
+                  <pic:nvPicPr>
+                    <pic:cNvPr id="1804586900" name=""/>
+                    <pic:cNvPicPr/>
+                  </pic:nvPicPr>
+                  <pic:blipFill>
+                    <a:blip r:embed="rId7"/>
+                    <a:stretch>
+                      <a:fillRect/>
+                    </a:stretch>
+                  </pic:blipFill>
+                  <pic:spPr>
+                    <a:xfrm>
+                      <a:off x="0" y="0"/>
+                      <a:ext cx="5943600" cy="815975"/>
+                    </a:xfrm>
+                    <a:prstGeom prst="rect">
+                      <a:avLst/>
+                    </a:prstGeom>
+                  </pic:spPr>
+                </pic:pic>
+              </a:graphicData>
+            </a:graphic>
+          </wp:inline>
+        </w:drawing>
+      </w:r>
+    </w:p>
+    <w:p>
+      <w:r>
+        <w:t xml:space="preserve">The number of unemployed in </w:t>
+      </w:r>
+      <w:r>
+        <w:t>Nevada</w:t>
+      </w:r>
+      <w:r>
+        <w:t xml:space="preserve"> in 2020 is higher than in 2019 due to the impact of COVID-19, and decreased in 2021 after the economic recovery</w:t>
+      </w:r>
+      <w:r>
+        <w:t xml:space="preserve"> </w:t>
+      </w:r>
+    </w:p>
+    <w:p>
+      <w:pPr>
+        <w:rPr>
+          <w:color w:val="156082" w:themeColor="accent1"/>
+        </w:rPr>
+      </w:pPr>
+      <w:r>
+        <w:rPr>
+          <w:color w:val="156082" w:themeColor="accent1"/>
+        </w:rPr>
+        <w:t>awk '/NV/ {print $1,$2,$3,$4,$5}' Unemp_labor.txt</w:t>
+      </w:r>
+    </w:p>
+    <w:p>
+      <w:r>
+        <w:drawing>
+          <wp:inline distT="0" distB="0" distL="0" distR="0" wp14:anchorId="7434E377" wp14:editId="6C5422E2">
+            <wp:extent cx="5943600" cy="2249805"/>
+            <wp:effectExtent l="0" t="0" r="0" b="0"/>
+            <wp:docPr id="1592565876" name="Picture 1"/>
+            <wp:cNvGraphicFramePr>
+              <a:graphicFrameLocks xmlns:a="http://schemas.openxmlformats.org/drawingml/2006/main" noChangeAspect="1"/>
+            </wp:cNvGraphicFramePr>
+            <a:graphic xmlns:a="http://schemas.openxmlformats.org/drawingml/2006/main">
+              <a:graphicData uri="http://schemas.openxmlformats.org/drawingml/2006/picture">
+                <pic:pic xmlns:pic="http://schemas.openxmlformats.org/drawingml/2006/picture">
+                  <pic:nvPicPr>
+                    <pic:cNvPr id="1592565876" name=""/>
+                    <pic:cNvPicPr/>
+                  </pic:nvPicPr>
+                  <pic:blipFill>
+                    <a:blip r:embed="rId8"/>
+                    <a:stretch>
+                      <a:fillRect/>
+                    </a:stretch>
+                  </pic:blipFill>
+                  <pic:spPr>
+                    <a:xfrm>
+                      <a:off x="0" y="0"/>
+                      <a:ext cx="5943600" cy="2249805"/>
+                    </a:xfrm>
+                    <a:prstGeom prst="rect">
+                      <a:avLst/>
+                    </a:prstGeom>
+                  </pic:spPr>
+                </pic:pic>
+              </a:graphicData>
+            </a:graphic>
+          </wp:inline>
+        </w:drawing>
+      </w:r>
+    </w:p>
     <w:sectPr>
       <w:pgSz w:w="12240" w:h="15840"/>
       <w:pgMar w:top="1440" w:right="1440" w:bottom="1440" w:left="1440" w:header="720" w:footer="720" w:gutter="0"/>

</xml_diff>

<commit_message>
updated homework1.docx w screenshot of awk to create new file and initial uploaded unemployment_force.txt
</commit_message>
<xml_diff>
--- a/Homework1.docx
+++ b/Homework1.docx
@@ -182,6 +182,91 @@
     </w:p>
     <w:p>
       <w:r>
+        <w:t>Create a new file named unemployment_force.txt with desired columns</w:t>
+      </w:r>
+    </w:p>
+    <w:p>
+      <w:pPr>
+        <w:rPr>
+          <w:color w:val="156082" w:themeColor="accent1"/>
+        </w:rPr>
+      </w:pPr>
+      <w:r>
+        <w:rPr>
+          <w:color w:val="156082" w:themeColor="accent1"/>
+        </w:rPr>
+        <w:t>awk -F</w:t>
+      </w:r>
+      <w:proofErr w:type="gramStart"/>
+      <w:r>
+        <w:rPr>
+          <w:color w:val="156082" w:themeColor="accent1"/>
+        </w:rPr>
+        <w:t>, '{</w:t>
+      </w:r>
+      <w:proofErr w:type="gramEnd"/>
+      <w:r>
+        <w:rPr>
+          <w:color w:val="156082" w:themeColor="accent1"/>
+        </w:rPr>
+        <w:t>print $2, $3, $58, $59, $41, $55, $51, $</w:t>
+      </w:r>
+      <w:proofErr w:type="gramStart"/>
+      <w:r>
+        <w:rPr>
+          <w:color w:val="156082" w:themeColor="accent1"/>
+        </w:rPr>
+        <w:t>53}'</w:t>
+      </w:r>
+      <w:proofErr w:type="gramEnd"/>
+      <w:r>
+        <w:rPr>
+          <w:color w:val="156082" w:themeColor="accent1"/>
+        </w:rPr>
+        <w:t xml:space="preserve"> Jobs_data.csv &gt; unemployment_force.txt</w:t>
+      </w:r>
+    </w:p>
+    <w:p>
+      <w:r>
+        <w:drawing>
+          <wp:inline distT="0" distB="0" distL="0" distR="0" wp14:anchorId="5120C739" wp14:editId="09F21C5D">
+            <wp:extent cx="5943600" cy="1234440"/>
+            <wp:effectExtent l="0" t="0" r="0" b="3810"/>
+            <wp:docPr id="726039721" name="Picture 1"/>
+            <wp:cNvGraphicFramePr>
+              <a:graphicFrameLocks xmlns:a="http://schemas.openxmlformats.org/drawingml/2006/main" noChangeAspect="1"/>
+            </wp:cNvGraphicFramePr>
+            <a:graphic xmlns:a="http://schemas.openxmlformats.org/drawingml/2006/main">
+              <a:graphicData uri="http://schemas.openxmlformats.org/drawingml/2006/picture">
+                <pic:pic xmlns:pic="http://schemas.openxmlformats.org/drawingml/2006/picture">
+                  <pic:nvPicPr>
+                    <pic:cNvPr id="726039721" name=""/>
+                    <pic:cNvPicPr/>
+                  </pic:nvPicPr>
+                  <pic:blipFill>
+                    <a:blip r:embed="rId6"/>
+                    <a:stretch>
+                      <a:fillRect/>
+                    </a:stretch>
+                  </pic:blipFill>
+                  <pic:spPr>
+                    <a:xfrm>
+                      <a:off x="0" y="0"/>
+                      <a:ext cx="5943600" cy="1234440"/>
+                    </a:xfrm>
+                    <a:prstGeom prst="rect">
+                      <a:avLst/>
+                    </a:prstGeom>
+                  </pic:spPr>
+                </pic:pic>
+              </a:graphicData>
+            </a:graphic>
+          </wp:inline>
+        </w:drawing>
+      </w:r>
+    </w:p>
+    <w:p>
+      <w:r>
         <w:t xml:space="preserve">The goal is </w:t>
       </w:r>
       <w:r>
@@ -193,11 +278,16 @@
       <w:r>
         <w:t xml:space="preserve">some specific states in 2019 – 2021. Since each state has various </w:t>
       </w:r>
+      <w:proofErr w:type="gramStart"/>
       <w:r>
         <w:t>number</w:t>
       </w:r>
       <w:r>
-        <w:t xml:space="preserve"> of counties, therefore it is necessary to calculate the unemployment rate of those states based on their civilian labor force</w:t>
+        <w:t xml:space="preserve"> of counties</w:t>
+      </w:r>
+      <w:proofErr w:type="gramEnd"/>
+      <w:r>
+        <w:t>, therefore it is necessary to calculate the unemployment rate of those states based on their civilian labor force</w:t>
       </w:r>
       <w:r>
         <w:t>.</w:t>
@@ -272,6 +362,7 @@
           </w:tcPr>
           <w:p>
             <w:r>
+              <w:lastRenderedPageBreak/>
               <w:t>County</w:t>
             </w:r>
           </w:p>
@@ -509,7 +600,6 @@
           <w:b/>
           <w:bCs/>
         </w:rPr>
-        <w:lastRenderedPageBreak/>
         <w:t>B - Using awk to create a new file with desired columns</w:t>
       </w:r>
     </w:p>
@@ -549,6 +639,9 @@
     </w:p>
     <w:p>
       <w:r>
+        <w:rPr>
+          <w:noProof/>
+        </w:rPr>
         <w:drawing>
           <wp:inline distT="0" distB="0" distL="0" distR="0" wp14:anchorId="43FFEF9B" wp14:editId="36CB0543">
             <wp:extent cx="5943600" cy="1356995"/>
@@ -565,7 +658,7 @@
                     <pic:cNvPicPr/>
                   </pic:nvPicPr>
                   <pic:blipFill>
-                    <a:blip r:embed="rId6"/>
+                    <a:blip r:embed="rId7"/>
                     <a:stretch>
                       <a:fillRect/>
                     </a:stretch>
@@ -588,26 +681,48 @@
     </w:p>
     <w:p>
       <w:r>
-        <w:t>The number of unemployed in Hawai in 2020 is higher than in 2019 due to the impact of COVID-19, and decreased in 2021 after the economic recovery</w:t>
-      </w:r>
-      <w:r>
-        <w:t xml:space="preserve"> </w:t>
-      </w:r>
-    </w:p>
-    <w:p>
-      <w:r>
-        <w:rPr>
-          <w:color w:val="156082" w:themeColor="accent1"/>
-        </w:rPr>
-        <w:t>awk '/HI/ {print $1,$2,$3,$4,$5}' Unemp_labor.txt</w:t>
-      </w:r>
-      <w:r>
-        <w:rPr>
-          <w:color w:val="156082" w:themeColor="accent1"/>
-        </w:rPr>
-        <w:t xml:space="preserve"> </w:t>
-      </w:r>
-      <w:r>
+        <w:t xml:space="preserve">The number of unemployed in Hawai in 2020 is higher than in 2019 due to the impact of COVID-19, and decreased in 2021 after the economic recovery </w:t>
+      </w:r>
+    </w:p>
+    <w:p>
+      <w:r>
+        <w:rPr>
+          <w:color w:val="156082" w:themeColor="accent1"/>
+        </w:rPr>
+        <w:t>awk '/</w:t>
+      </w:r>
+      <w:proofErr w:type="gramStart"/>
+      <w:r>
+        <w:rPr>
+          <w:color w:val="156082" w:themeColor="accent1"/>
+        </w:rPr>
+        <w:t>HI/ {</w:t>
+      </w:r>
+      <w:proofErr w:type="gramEnd"/>
+      <w:r>
+        <w:rPr>
+          <w:color w:val="156082" w:themeColor="accent1"/>
+        </w:rPr>
+        <w:t>print $1,$2,$3,$4,$</w:t>
+      </w:r>
+      <w:proofErr w:type="gramStart"/>
+      <w:r>
+        <w:rPr>
+          <w:color w:val="156082" w:themeColor="accent1"/>
+        </w:rPr>
+        <w:t>5}'</w:t>
+      </w:r>
+      <w:proofErr w:type="gramEnd"/>
+      <w:r>
+        <w:rPr>
+          <w:color w:val="156082" w:themeColor="accent1"/>
+        </w:rPr>
+        <w:t xml:space="preserve"> Unemp_labor.txt </w:t>
+      </w:r>
+      <w:r>
+        <w:rPr>
+          <w:noProof/>
+        </w:rPr>
         <w:drawing>
           <wp:inline distT="0" distB="0" distL="0" distR="0" wp14:anchorId="673EDDA4" wp14:editId="50F0E80A">
             <wp:extent cx="5943600" cy="815975"/>
@@ -624,7 +739,7 @@
                     <pic:cNvPicPr/>
                   </pic:nvPicPr>
                   <pic:blipFill>
-                    <a:blip r:embed="rId7"/>
+                    <a:blip r:embed="rId8"/>
                     <a:stretch>
                       <a:fillRect/>
                     </a:stretch>
@@ -653,10 +768,7 @@
         <w:t>Nevada</w:t>
       </w:r>
       <w:r>
-        <w:t xml:space="preserve"> in 2020 is higher than in 2019 due to the impact of COVID-19, and decreased in 2021 after the economic recovery</w:t>
-      </w:r>
-      <w:r>
-        <w:t xml:space="preserve"> </w:t>
+        <w:t xml:space="preserve"> in 2020 is higher than in 2019 due to the impact of COVID-19, and decreased in 2021 after the economic recovery </w:t>
       </w:r>
     </w:p>
     <w:p>
@@ -674,6 +786,10 @@
     </w:p>
     <w:p>
       <w:r>
+        <w:rPr>
+          <w:noProof/>
+        </w:rPr>
+        <w:lastRenderedPageBreak/>
         <w:drawing>
           <wp:inline distT="0" distB="0" distL="0" distR="0" wp14:anchorId="7434E377" wp14:editId="6C5422E2">
             <wp:extent cx="5943600" cy="2249805"/>
@@ -690,7 +806,7 @@
                     <pic:cNvPicPr/>
                   </pic:nvPicPr>
                   <pic:blipFill>
-                    <a:blip r:embed="rId8"/>
+                    <a:blip r:embed="rId9"/>
                     <a:stretch>
                       <a:fillRect/>
                     </a:stretch>

</xml_diff>